<commit_message>
feat: numero secuencial por cliente en Mis casos y codigo completo en el detalle (CU-03 en adelante)
</commit_message>
<xml_diff>
--- a/docs/casos-de-uso-v2/CU-03 Consultar Estado de Casos.docx
+++ b/docs/casos-de-uso-v2/CU-03 Consultar Estado de Casos.docx
@@ -856,7 +856,7 @@
           <w:sz w:val="22"/>
           <w:szCs w:val="22"/>
         </w:rPr>
-        <w:t xml:space="preserve">El sistema muestra una tabla con una fila por caso y las siguientes columnas (FA01, FA02):</w:t>
+        <w:t xml:space="preserve">El sistema muestra una tabla con una fila por caso y las siguientes columnas (FA01, FA02). El número de caso es secuencial por cliente: el primer caso que registró es el 1, el segundo el 2, y así sucesivamente:</w:t>
       </w:r>
     </w:p>
     <w:tbl>
@@ -1028,7 +1028,7 @@
                 <w:sz w:val="20"/>
                 <w:szCs w:val="20"/>
               </w:rPr>
-              <w:t xml:space="preserve">No. Caso (identificador del caso)</w:t>
+              <w:t xml:space="preserve">No. Caso (número secuencial del caso entre los casos del cliente: 1, 2, 3…)</w:t>
             </w:r>
           </w:p>
         </w:tc>
@@ -1057,7 +1057,7 @@
                 <w:sz w:val="20"/>
                 <w:szCs w:val="20"/>
               </w:rPr>
-              <w:t xml:space="preserve">alfanumérico</w:t>
+              <w:t xml:space="preserve">numérico</w:t>
             </w:r>
           </w:p>
         </w:tc>
@@ -1115,7 +1115,7 @@
                 <w:sz w:val="20"/>
                 <w:szCs w:val="20"/>
               </w:rPr>
-              <w:t xml:space="preserve">20 caracteres</w:t>
+              <w:t xml:space="preserve">10 caracteres</w:t>
             </w:r>
           </w:p>
         </w:tc>
@@ -1775,7 +1775,7 @@
           <w:sz w:val="22"/>
           <w:szCs w:val="22"/>
         </w:rPr>
-        <w:t xml:space="preserve">El sistema abre la ventana “Detalle del Caso: &lt;código&gt;”, con el tipo de caso, la sucursal, el motivo, la fecha de registro, la fecha de cierre (si ya está cerrado), el estado, el detalle del caso, las evidencias adjuntas, las respuestas oficiales, el historial de cambios de estado y, según corresponda, el motivo de cancelación, la evaluación del servicio y la solicitud de reapertura.</w:t>
+        <w:t xml:space="preserve">El sistema abre la ventana “Detalle del Caso: &lt;número&gt;”, con el código completo del caso (por ejemplo, “SUG-INS-15”, para futuras consultas con el restaurante), el tipo de caso, la sucursal, el motivo, la fecha de registro, la fecha de cierre (si ya está cerrado), el estado, el detalle del caso, las evidencias adjuntas, las respuestas oficiales, el historial de cambios de estado y, según corresponda, el motivo de cancelación, la evaluación del servicio y la solicitud de reapertura.</w:t>
       </w:r>
     </w:p>
     <w:p>

</xml_diff>